<commit_message>
docs: Add development workflow and update checklists for PR-based flow
Add docs/WORKFLOW.md and Development Workflow.docx documenting the new
branch-and-PR workflow with mandatory CI checks before merging to main.

Update both checklists (Feature + Release) to reference PR-based flow
instead of direct pushes to main.

Add workflow reference to README Contributing section.

Co-Authored-By: Claude Opus 4.6 <noreply@anthropic.com>
</commit_message>
<xml_diff>
--- a/Notemac++ - New Feature Checklist.docx
+++ b/Notemac++ - New Feature Checklist.docx
@@ -3237,67 +3237,67 @@
                 <w:sz w:val="20"/>
                 <w:szCs w:val="20"/>
               </w:rPr>
-              <w:t xml:space="preserve">Pushed to main branch</w:t>
-            </w:r>
-          </w:p>
-        </w:tc>
-      </w:tr>
-      <w:tr>
-        <w:tc>
-          <w:tcPr>
-            <w:tcW w:type="dxa" w:w="600"/>
-            <w:tcBorders>
-              <w:top w:val="single" w:color="CCCCCC" w:sz="1"/>
-              <w:left w:val="single" w:color="CCCCCC" w:sz="1"/>
-              <w:bottom w:val="single" w:color="CCCCCC" w:sz="1"/>
-              <w:right w:val="single" w:color="CCCCCC" w:sz="1"/>
-            </w:tcBorders>
-            <w:tcMar>
-              <w:top w:type="dxa" w:w="80"/>
-              <w:left w:type="dxa" w:w="120"/>
-              <w:bottom w:type="dxa" w:w="80"/>
-              <w:right w:type="dxa" w:w="120"/>
-            </w:tcMar>
-            <w:vAlign w:val="center"/>
-          </w:tcPr>
-          <w:p>
-            <w:pPr>
-              <w:jc w:val="center"/>
-            </w:pPr>
-            <w:r>
-              <w:rPr>
-                <w:rFonts w:ascii="Arial" w:cs="Arial" w:eastAsia="Arial" w:hAnsi="Arial"/>
-                <w:sz w:val="24"/>
-                <w:szCs w:val="24"/>
-              </w:rPr>
-              <w:t xml:space="preserve">☐</w:t>
-            </w:r>
-          </w:p>
-        </w:tc>
-        <w:tc>
-          <w:tcPr>
-            <w:tcW w:type="dxa" w:w="8760"/>
-            <w:tcBorders>
-              <w:top w:val="single" w:color="CCCCCC" w:sz="1"/>
-              <w:left w:val="single" w:color="CCCCCC" w:sz="1"/>
-              <w:bottom w:val="single" w:color="CCCCCC" w:sz="1"/>
-              <w:right w:val="single" w:color="CCCCCC" w:sz="1"/>
-            </w:tcBorders>
-            <w:tcMar>
-              <w:top w:type="dxa" w:w="80"/>
-              <w:left w:type="dxa" w:w="120"/>
-              <w:bottom w:type="dxa" w:w="80"/>
-              <w:right w:type="dxa" w:w="120"/>
-            </w:tcMar>
-          </w:tcPr>
-          <w:p>
-            <w:r>
-              <w:rPr>
-                <w:rFonts w:ascii="Arial" w:cs="Arial" w:eastAsia="Arial" w:hAnsi="Arial"/>
-                <w:sz w:val="20"/>
-                <w:szCs w:val="20"/>
-              </w:rPr>
-              <w:t xml:space="preserve">CI pipeline passes (Type check + Build + Tests)</w:t>
+              <w:t xml:space="preserve">Pushed to feature branch and PR opened targeting main</w:t>
+            </w:r>
+          </w:p>
+        </w:tc>
+      </w:tr>
+      <w:tr>
+        <w:tc>
+          <w:tcPr>
+            <w:tcW w:type="dxa" w:w="600"/>
+            <w:tcBorders>
+              <w:top w:val="single" w:color="CCCCCC" w:sz="1"/>
+              <w:left w:val="single" w:color="CCCCCC" w:sz="1"/>
+              <w:bottom w:val="single" w:color="CCCCCC" w:sz="1"/>
+              <w:right w:val="single" w:color="CCCCCC" w:sz="1"/>
+            </w:tcBorders>
+            <w:tcMar>
+              <w:top w:type="dxa" w:w="80"/>
+              <w:left w:type="dxa" w:w="120"/>
+              <w:bottom w:type="dxa" w:w="80"/>
+              <w:right w:type="dxa" w:w="120"/>
+            </w:tcMar>
+            <w:vAlign w:val="center"/>
+          </w:tcPr>
+          <w:p>
+            <w:pPr>
+              <w:jc w:val="center"/>
+            </w:pPr>
+            <w:r>
+              <w:rPr>
+                <w:rFonts w:ascii="Arial" w:cs="Arial" w:eastAsia="Arial" w:hAnsi="Arial"/>
+                <w:sz w:val="24"/>
+                <w:szCs w:val="24"/>
+              </w:rPr>
+              <w:t xml:space="preserve">☐</w:t>
+            </w:r>
+          </w:p>
+        </w:tc>
+        <w:tc>
+          <w:tcPr>
+            <w:tcW w:type="dxa" w:w="8760"/>
+            <w:tcBorders>
+              <w:top w:val="single" w:color="CCCCCC" w:sz="1"/>
+              <w:left w:val="single" w:color="CCCCCC" w:sz="1"/>
+              <w:bottom w:val="single" w:color="CCCCCC" w:sz="1"/>
+              <w:right w:val="single" w:color="CCCCCC" w:sz="1"/>
+            </w:tcBorders>
+            <w:tcMar>
+              <w:top w:type="dxa" w:w="80"/>
+              <w:left w:type="dxa" w:w="120"/>
+              <w:bottom w:type="dxa" w:w="80"/>
+              <w:right w:type="dxa" w:w="120"/>
+            </w:tcMar>
+          </w:tcPr>
+          <w:p>
+            <w:r>
+              <w:rPr>
+                <w:rFonts w:ascii="Arial" w:cs="Arial" w:eastAsia="Arial" w:hAnsi="Arial"/>
+                <w:sz w:val="20"/>
+                <w:szCs w:val="20"/>
+              </w:rPr>
+              <w:t xml:space="preserve">CI pipeline passes on PR (all 5 required status checks green)</w:t>
             </w:r>
           </w:p>
         </w:tc>
@@ -3358,6 +3358,66 @@
                 <w:szCs w:val="20"/>
               </w:rPr>
               <w:t xml:space="preserve">No unintended file changes included in the commit (git diff review)</w:t>
+            </w:r>
+          </w:p>
+        </w:tc>
+      </w:tr>
+      <w:tr>
+        <w:tc>
+          <w:tcPr>
+            <w:tcW w:type="dxa" w:w="600"/>
+            <w:tcBorders>
+              <w:top w:val="single" w:color="CCCCCC" w:sz="1"/>
+              <w:left w:val="single" w:color="CCCCCC" w:sz="1"/>
+              <w:bottom w:val="single" w:color="CCCCCC" w:sz="1"/>
+              <w:right w:val="single" w:color="CCCCCC" w:sz="1"/>
+            </w:tcBorders>
+            <w:tcMar>
+              <w:top w:type="dxa" w:w="80"/>
+              <w:left w:type="dxa" w:w="120"/>
+              <w:bottom w:type="dxa" w:w="80"/>
+              <w:right w:type="dxa" w:w="120"/>
+            </w:tcMar>
+            <w:vAlign w:val="center"/>
+          </w:tcPr>
+          <w:p>
+            <w:pPr>
+              <w:jc w:val="center"/>
+            </w:pPr>
+            <w:r>
+              <w:rPr>
+                <w:rFonts w:ascii="Arial" w:cs="Arial" w:eastAsia="Arial" w:hAnsi="Arial"/>
+                <w:sz w:val="24"/>
+                <w:szCs w:val="24"/>
+              </w:rPr>
+              <w:t xml:space="preserve">☐</w:t>
+            </w:r>
+          </w:p>
+        </w:tc>
+        <w:tc>
+          <w:tcPr>
+            <w:tcW w:type="dxa" w:w="8760"/>
+            <w:tcBorders>
+              <w:top w:val="single" w:color="CCCCCC" w:sz="1"/>
+              <w:left w:val="single" w:color="CCCCCC" w:sz="1"/>
+              <w:bottom w:val="single" w:color="CCCCCC" w:sz="1"/>
+              <w:right w:val="single" w:color="CCCCCC" w:sz="1"/>
+            </w:tcBorders>
+            <w:tcMar>
+              <w:top w:type="dxa" w:w="80"/>
+              <w:left w:type="dxa" w:w="120"/>
+              <w:bottom w:type="dxa" w:w="80"/>
+              <w:right w:type="dxa" w:w="120"/>
+            </w:tcMar>
+          </w:tcPr>
+          <w:p>
+            <w:r>
+              <w:rPr>
+                <w:rFonts w:ascii="Arial" w:cs="Arial" w:eastAsia="Arial" w:hAnsi="Arial"/>
+                <w:sz w:val="20"/>
+                <w:szCs w:val="20"/>
+              </w:rPr>
+              <w:t xml:space="preserve">PR merged to main after all checks pass (no direct pushes to main)</w:t>
             </w:r>
           </w:p>
         </w:tc>

</xml_diff>